<commit_message>
Polish decision-first UX and refresh GitHub readiness docs
</commit_message>
<xml_diff>
--- a/PROJECT_HANDOFF_2026-04-05.docx
+++ b/PROJECT_HANDOFF_2026-04-05.docx
@@ -1,19 +1,3 @@
-
-<file path=docProps\app.xml><?xml version="1.0" encoding="utf-8"?>
-<Properties xmlns="http://schemas.openxmlformats.org/officeDocument/2006/extended-properties" xmlns:vt="http://schemas.openxmlformats.org/officeDocument/2006/docPropsVTypes">
-  <Application>Codex</Application>
-</Properties>
-</file>
-
-<file path=docProps\core.xml><?xml version="1.0" encoding="utf-8"?>
-<cp:coreProperties xmlns:cp="http://schemas.openxmlformats.org/package/2006/metadata/core-properties" xmlns:dc="http://purl.org/dc/elements/1.1/" xmlns:dcterms="http://purl.org/dc/terms/" xmlns:dcmitype="http://purl.org/dc/dcmitype/" xmlns:xsi="http://www.w3.org/2001/XMLSchema-instance">
-  <dc:title>PROJECT_HANDOFF_2026-04-05</dc:title>
-  <dc:creator>Codex</dc:creator>
-  <cp:lastModifiedBy>Codex</cp:lastModifiedBy>
-  <dcterms:created xsi:type="dcterms:W3CDTF">2026-04-05T16:30:51Z</dcterms:created>
-  <dcterms:modified xsi:type="dcterms:W3CDTF">2026-04-05T16:30:51Z</dcterms:modified>
-</cp:coreProperties>
-</file>
 
 <file path=word\document.xml><?xml version="1.0" encoding="utf-8"?>
 <w:document xmlns:wpc="http://schemas.microsoft.com/office/word/2010/wordprocessingCanvas" xmlns:mc="http://schemas.openxmlformats.org/markup-compatibility/2006" xmlns:o="urn:schemas-microsoft-com:office:office" xmlns:r="http://schemas.openxmlformats.org/officeDocument/2006/relationships" xmlns:m="http://schemas.openxmlformats.org/officeDocument/2006/math" xmlns:v="urn:schemas-microsoft-com:vml" xmlns:wp14="http://schemas.microsoft.com/office/word/2010/wordprocessingDrawing" xmlns:wp="http://schemas.openxmlformats.org/drawingml/2006/wordprocessingDrawing" xmlns:w10="urn:schemas-microsoft-com:office:word" xmlns:w="http://schemas.openxmlformats.org/wordprocessingml/2006/main" xmlns:w14="http://schemas.microsoft.com/office/word/2010/wordml" xmlns:wpg="http://schemas.microsoft.com/office/word/2010/wordprocessingGroup" xmlns:wpi="http://schemas.microsoft.com/office/word/2010/wordprocessingInk" xmlns:wne="http://schemas.microsoft.com/office/word/2006/wordml" xmlns:wps="http://schemas.microsoft.com/office/word/2010/wordprocessingShape" mc:Ignorable="w14 wp14">
@@ -36,7 +20,7 @@
     </w:p>
     <w:p>
       <w:r>
-        <w:t xml:space="preserve">Last refreshed: April 5, 2026 after the loop-art integration pass, narrow-phone UI cleanup, focused Android regression, fresh release APK verification, and GitHub-readiness doc sweep.</w:t>
+        <w:t xml:space="preserve">Last refreshed: April 5, 2026 after the loop-readability, universal-design, local UX telemetry, validation, and GitHub-readiness pass.</w:t>
       </w:r>
     </w:p>
     <w:p/>
@@ -114,6 +98,86 @@
     </w:p>
     <w:p>
       <w:r>
+        <w:t xml:space="preserve">- The highest-value gameplay screens now prioritize real decisions over process copy:</w:t>
+      </w:r>
+    </w:p>
+    <w:p>
+      <w:r>
+        <w:t xml:space="preserve">  - `Mission Brief` sits above route choice and defaults closed</w:t>
+      </w:r>
+    </w:p>
+    <w:p>
+      <w:r>
+        <w:t xml:space="preserve">  - route, event, reward, and recap art frames now read like portrait-card previews instead of wide banners</w:t>
+      </w:r>
+    </w:p>
+    <w:p>
+      <w:r>
+        <w:t xml:space="preserve">  - event class/crew reads and setup chemistry/role details now use progressive disclosure instead of front-loading non-essential text</w:t>
+      </w:r>
+    </w:p>
+    <w:p>
+      <w:r>
+        <w:t xml:space="preserve">  - title no longer shows a dead `Resume Dive` CTA when no active run exists</w:t>
+      </w:r>
+    </w:p>
+    <w:p>
+      <w:r>
+        <w:t xml:space="preserve">- Combat status language is now player-readable:</w:t>
+      </w:r>
+    </w:p>
+    <w:p>
+      <w:r>
+        <w:t xml:space="preserve">  - statuses now render as named effects with durations and summaries instead of shorthand like `Escalated (2)`</w:t>
+      </w:r>
+    </w:p>
+    <w:p>
+      <w:r>
+        <w:t xml:space="preserve">- Crew-channel repetition is reduced:</w:t>
+      </w:r>
+    </w:p>
+    <w:p>
+      <w:r>
+        <w:t xml:space="preserve">  - battle chatter now rotates across multiple variants keyed by encounter/state instead of feeling copy-pasted through a run</w:t>
+      </w:r>
+    </w:p>
+    <w:p>
+      <w:r>
+        <w:t xml:space="preserve">- Accessibility settings now have a live visible preview:</w:t>
+      </w:r>
+    </w:p>
+    <w:p>
+      <w:r>
+        <w:t xml:space="preserve">  - `High Contrast`, `Color Assist`, `Reduced Motion`, text sizing, and readability assists now have clearer visible consequences in `app/settings.tsx`</w:t>
+      </w:r>
+    </w:p>
+    <w:p>
+      <w:r>
+        <w:t xml:space="preserve">- Local-only UX telemetry now exists for validation work:</w:t>
+      </w:r>
+    </w:p>
+    <w:p>
+      <w:r>
+        <w:t xml:space="preserve">  - `src/state/uxTelemetryStore.ts` tracks runs started, route selection churn, first-floor route-commit timing, repeated crew-scene reuse, crew-scene views, and `Run It Back` taps</w:t>
+      </w:r>
+    </w:p>
+    <w:p>
+      <w:r>
+        <w:t xml:space="preserve">  - `app/dev-smoke.tsx` surfaces those metrics in a native-only `Smoke Lab` summary panel</w:t>
+      </w:r>
+    </w:p>
+    <w:p>
+      <w:r>
+        <w:t xml:space="preserve">- Public-facing support and privacy wording is now aligned:</w:t>
+      </w:r>
+    </w:p>
+    <w:p>
+      <w:r>
+        <w:t xml:space="preserve">  - `README.md`, `SUPPORT.md`, `PRIVACY_POLICY.md`, `app/support.tsx`, and `app/privacy.tsx` now consistently describe the offline/local-save product shape and the dev-only/local-only telemetry scope</w:t>
+      </w:r>
+    </w:p>
+    <w:p>
+      <w:r>
         <w:t xml:space="preserve">- A real Android blocker was fixed for local native runs:</w:t>
       </w:r>
     </w:p>
@@ -161,7 +225,7 @@
     </w:p>
     <w:p>
       <w:r>
-        <w:t xml:space="preserve">  - companion setup on new runs</w:t>
+        <w:t xml:space="preserve">  - class setup when multiple classes are unlocked, otherwise companion setup</w:t>
       </w:r>
     </w:p>
     <w:p>
@@ -216,6 +280,31 @@
     </w:p>
     <w:p>
       <w:r>
+        <w:t xml:space="preserve">- Settings/accessibility controls are now meaningfully testable in the app itself:</w:t>
+      </w:r>
+    </w:p>
+    <w:p>
+      <w:r>
+        <w:t xml:space="preserve">  - the settings screen includes a live preview block and preview buttons so visual changes are obvious before a run starts</w:t>
+      </w:r>
+    </w:p>
+    <w:p>
+      <w:r>
+        <w:t xml:space="preserve">- `dev-smoke` remains native-only and is now a better release-hardening tool:</w:t>
+      </w:r>
+    </w:p>
+    <w:p>
+      <w:r>
+        <w:t xml:space="preserve">  - final-boss near-win / near-loss seeding is still present</w:t>
+      </w:r>
+    </w:p>
+    <w:p>
+      <w:r>
+        <w:t xml:space="preserve">  - local-only UX telemetry summaries make it easier to validate opening clarity and restart impulse during manual QA</w:t>
+      </w:r>
+    </w:p>
+    <w:p>
+      <w:r>
         <w:t xml:space="preserve">- The newly integrated runtime art is intentionally scoped:</w:t>
       </w:r>
     </w:p>
@@ -262,6 +351,16 @@
         <w:t xml:space="preserve">- `npm run smoke:sim`: passed</w:t>
       </w:r>
     </w:p>
+    <w:p>
+      <w:r>
+        <w:t xml:space="preserve">- GitHub validation workflow still matches the local release gate:</w:t>
+      </w:r>
+    </w:p>
+    <w:p>
+      <w:r>
+        <w:t xml:space="preserve">  - `.github/workflows/validate.yml` runs `npm run lint`, `npx tsc --noEmit`, and `npm run smoke:sim`</w:t>
+      </w:r>
+    </w:p>
     <w:p/>
     <w:p>
       <w:r>
@@ -302,6 +401,53 @@
     <w:p/>
     <w:p>
       <w:r>
+        <w:t xml:space="preserve">New manual follow-up is still recommended for the just-landed loop/readability pass:</w:t>
+      </w:r>
+    </w:p>
+    <w:p/>
+    <w:p>
+      <w:r>
+        <w:t xml:space="preserve">- title -&gt; start-new-dive clarity on a fresh profile</w:t>
+      </w:r>
+    </w:p>
+    <w:p>
+      <w:r>
+        <w:t xml:space="preserve">- class-select -&gt; companion-select clarity when multiple classes are unlocked</w:t>
+      </w:r>
+    </w:p>
+    <w:p>
+      <w:r>
+        <w:t xml:space="preserve">- floor-1 route selection / route commit readability on phone hardware</w:t>
+      </w:r>
+    </w:p>
+    <w:p>
+      <w:r>
+        <w:t xml:space="preserve">- event decision readability with collapsed class/crew reads</w:t>
+      </w:r>
+    </w:p>
+    <w:p>
+      <w:r>
+        <w:t xml:space="preserve">- reward readability with selected package preview above the options</w:t>
+      </w:r>
+    </w:p>
+    <w:p>
+      <w:r>
+        <w:t xml:space="preserve">- settings live-preview visibility on target devices</w:t>
+      </w:r>
+    </w:p>
+    <w:p>
+      <w:r>
+        <w:t xml:space="preserve">- native-only `Smoke Lab` telemetry counters updating as expected</w:t>
+      </w:r>
+    </w:p>
+    <w:p>
+      <w:r>
+        <w:t xml:space="preserve">- support/privacy route copy matching the latest repo policy wording on-device</w:t>
+      </w:r>
+    </w:p>
+    <w:p/>
+    <w:p>
+      <w:r>
         <w:t xml:space="preserve">Fresh-install release APK verification also completed:</w:t>
       </w:r>
     </w:p>
@@ -408,6 +554,11 @@
     </w:p>
     <w:p>
       <w:r>
+        <w:t xml:space="preserve">   - whether the route, event, reward, and recap screens now feel clearer on first read</w:t>
+      </w:r>
+    </w:p>
+    <w:p>
+      <w:r>
         <w:t xml:space="preserve">3. Finalize the public support inbox.</w:t>
       </w:r>
     </w:p>
@@ -465,6 +616,11 @@
     </w:p>
     <w:p>
       <w:r>
+        <w:t xml:space="preserve">- Keep `src/state/uxTelemetryStore.ts` local-only unless the privacy model is intentionally expanded later.</w:t>
+      </w:r>
+    </w:p>
+    <w:p>
+      <w:r>
         <w:t xml:space="preserve">- Keep feature freeze intact until outside testing or store review reveals a real blocker.</w:t>
       </w:r>
     </w:p>
@@ -570,7 +726,7 @@
     </w:p>
     <w:p>
       <w:r>
-        <w:t xml:space="preserve">- April 5 is now the freshest release, tester-build, and GitHub-readiness snapshot</w:t>
+        <w:t xml:space="preserve">- April 5 is now the freshest release, tester-build, loop-readability, and GitHub-readiness snapshot</w:t>
       </w:r>
     </w:p>
     <w:sectPr>

</xml_diff>